<commit_message>
Panel (b) of proposal fig 1: road distance in miles, on panel (a)'s scale
nicu_access() now weights the multi-source Dijkstra by length_m rather
than time_s and adds the centroid snap distance back, exactly as
04_compute_access.py does, so panels (a) and (b) are built the same way
end to end. Both use the same mile bands and the same colour ramp.

This restores the comparison the figure exists to make - which the
earlier km/minutes split had broken - and the difference is now legible
straight off the maps:

  beyond 10 mi -- any 22.5%   NICU 30.5%
  beyond 25 mi -- any  5.1%   NICU 13.0%
  beyond 50 mi -- any  0.4%   NICU  4.5%

The proposal can therefore point at panels (a) and (b) again; that
sentence is restored with the mileage figures, and the caption notes the
shared scale.

Co-Authored-By: Claude Opus 5 (1M context) <noreply@anthropic.com>
</commit_message>
<xml_diff>
--- a/proposal/Revised_Proposal_2026.docx
+++ b/proposal/Revised_Proposal_2026.docx
@@ -790,7 +790,7 @@
         <w:jc w:val="both"/>
       </w:pPr>
       <w:r>
-        <w:t>care, and that distinction is exactly where preventable deaths occur — the</w:t>
+        <w:t>care, and that distinction is exactly where preventable deaths occur. Panels (a)</w:t>
       </w:r>
     </w:p>
     <w:p>
@@ -798,7 +798,31 @@
         <w:jc w:val="both"/>
       </w:pPr>
       <w:r>
-        <w:t>30-minute rows of the table above compare like with like.</w:t>
+        <w:t>and (b) of Figure 1 are drawn on the identical mileage scale, so the gap between</w:t>
+      </w:r>
+    </w:p>
+    <w:p>
+      <w:pPr>
+        <w:jc w:val="both"/>
+      </w:pPr>
+      <w:r>
+        <w:t>them can be read directly: **5.1% of Texans live more than 25 road miles from any</w:t>
+      </w:r>
+    </w:p>
+    <w:p>
+      <w:pPr>
+        <w:jc w:val="both"/>
+      </w:pPr>
+      <w:r>
+        <w:t>obstetric facility, but 13.0% live more than 25 miles from one with a NICU. Past</w:t>
+      </w:r>
+    </w:p>
+    <w:p>
+      <w:pPr>
+        <w:jc w:val="both"/>
+      </w:pPr>
+      <w:r>
+        <w:t>50 miles the ratio widens to eleven-fold — 0.4% versus 4.5%.**</w:t>
       </w:r>
     </w:p>
     <w:p>
@@ -892,7 +916,7 @@
         <w:jc w:val="both"/>
       </w:pPr>
       <w:r>
-        <w:t>obstetric facility, in miles. (b) Drive time to the nearest NICU-capable</w:t>
+        <w:t>obstetric facility, in miles. (b) Road distance to the nearest NICU-capable</w:t>
       </w:r>
     </w:p>
     <w:p>
@@ -900,7 +924,7 @@
         <w:jc w:val="both"/>
       </w:pPr>
       <w:r>
-        <w:t>facility, in minutes — note the different unit and colour scale. (c) Texas</w:t>
+        <w:t>facility, on the identical scale — the two maps are directly comparable, and (b)</w:t>
       </w:r>
     </w:p>
     <w:p>
@@ -908,7 +932,7 @@
         <w:jc w:val="both"/>
       </w:pPr>
       <w:r>
-        <w:t>population by road-distance band, in miles. (d) Counties holding a hospital that has no</w:t>
+        <w:t>is visibly darker. (c) Texas population by road-distance band, in miles. (d) Counties holding a hospital that has no</w:t>
       </w:r>
     </w:p>
     <w:p>

</xml_diff>

<commit_message>
Spell out CMS, DSHS and AHA at first mention
- CMS -> Centers for Medicare & Medicaid Services, first used in Aim 1
  of the proposal and on slide 1 of the deck.
- DSHS -> Texas Department of State Health Services
- AHA  -> American Hospital Association (Annual Survey)

Both DSHS and AHA appear once, in the risk table, so the expansion is
also their only mention. Later bare "CMS" uses are left as-is now that
the acronym is introduced.

Co-Authored-By: Claude Opus 5 (1M context) <noreply@anthropic.com>
</commit_message>
<xml_diff>
--- a/proposal/Revised_Proposal_2026.docx
+++ b/proposal/Revised_Proposal_2026.docx
@@ -1321,7 +1321,15 @@
         <w:jc w:val="both"/>
       </w:pPr>
       <w:r>
-        <w:t>facility panel backward through CMS Provider of Services archives so the analysis</w:t>
+        <w:t>facility panel backward through Centers for Medicare &amp; Medicaid Services (CMS)</w:t>
+      </w:r>
+    </w:p>
+    <w:p>
+      <w:pPr>
+        <w:jc w:val="both"/>
+      </w:pPr>
+      <w:r>
+        <w:t>Provider of Services archives so the analysis</w:t>
       </w:r>
     </w:p>
     <w:p>
@@ -1980,7 +1988,7 @@
               <w:rPr>
                 <w:sz w:val="18"/>
               </w:rPr>
-              <w:t>Cross-check against Texas DSHS maternal designations and AHA survey; report the vintage of every flag</w:t>
+              <w:t>Cross-check against Texas Department of State Health Services (DSHS) maternal designations and the American Hospital Association (AHA) Annual Survey; report the vintage of every flag</w:t>
             </w:r>
           </w:p>
         </w:tc>

</xml_diff>